<commit_message>
Ajout de la date de soumission au document
</commit_message>
<xml_diff>
--- a/rapport-final/Cloud&BigData-rapport_final.docx
+++ b/rapport-final/Cloud&BigData-rapport_final.docx
@@ -189,7 +189,7 @@
           <w:noProof/>
         </w:rPr>
         <w:pict w14:anchorId="7B830179">
-          <v:shape id="Graphic 1" o:spid="_x0000_s1031" style="position:absolute;margin-left:443.25pt;margin-top:4.05pt;width:36pt;height:.1pt;z-index:-503316474;visibility:visible;mso-wrap-style:square;mso-wrap-distance-left:0;mso-wrap-distance-top:0;mso-wrap-distance-right:0;mso-wrap-distance-bottom:0;mso-position-horizontal:absolute;mso-position-horizontal-relative:page;mso-position-vertical:absolute;mso-position-vertical-relative:text;v-text-anchor:top" coordsize="457200,1440" o:spt="100" o:gfxdata="" o:allowincell="f" adj="0,,0" path="m,l457200,e" filled="f" strokeweight="1pt">
+          <v:shape id="Graphic 1" o:spid="_x0000_s1031" style="position:absolute;margin-left:443.25pt;margin-top:4.05pt;width:36pt;height:.1pt;z-index:-503316474;visibility:visible;mso-wrap-style:square;mso-wrap-distance-left:0;mso-wrap-distance-top:0;mso-wrap-distance-right:0;mso-wrap-distance-bottom:0;mso-position-horizontal:absolute;mso-position-horizontal-relative:page;mso-position-vertical:absolute;mso-position-vertical-relative:text;v-text-anchor:top" coordsize="457200,1440" o:spt="100" o:allowincell="f" adj="0,,0" path="m,l457200,e" filled="f" strokeweight="1pt">
             <v:stroke joinstyle="round"/>
             <v:formulas/>
             <v:path arrowok="t" o:connecttype="segments" textboxrect="0,0,457835,2160"/>
@@ -546,7 +546,7 @@
           <w:noProof/>
         </w:rPr>
         <w:pict w14:anchorId="3FDEAEF4">
-          <v:group id="Group 3" o:spid="_x0000_s1027" style="position:absolute;margin-left:82.55pt;margin-top:18.85pt;width:440.2pt;height:92.2pt;z-index:-503316473;mso-wrap-distance-left:0;mso-wrap-distance-right:0;mso-position-horizontal-relative:page" coordsize="55904,11710" o:gfxdata="" o:allowincell="f">
+          <v:group id="Group 3" o:spid="_x0000_s1027" style="position:absolute;margin-left:82.55pt;margin-top:18.85pt;width:440.2pt;height:92.2pt;z-index:-503316473;mso-wrap-distance-left:0;mso-wrap-distance-right:0;mso-position-horizontal-relative:page" coordsize="55904,11710" o:allowincell="f">
             <v:shapetype id="_x0000_t75" coordsize="21600,21600" o:spt="75" o:preferrelative="t" path="m@4@5l@4@11@9@11@9@5xe" filled="f" stroked="f">
               <v:stroke joinstyle="miter"/>
               <v:formulas>
@@ -566,15 +566,15 @@
               <v:path o:extrusionok="f" gradientshapeok="t" o:connecttype="rect"/>
               <o:lock v:ext="edit" aspectratio="t"/>
             </v:shapetype>
-            <v:shape id="Image 4" o:spid="_x0000_s1028" type="#_x0000_t75" style="position:absolute;left:64;top:64;width:55779;height:11578;visibility:visible;mso-wrap-style:square" o:gfxdata="" strokeweight="0">
+            <v:shape id="Image 4" o:spid="_x0000_s1028" type="#_x0000_t75" style="position:absolute;left:64;top:64;width:55779;height:11578;visibility:visible;mso-wrap-style:square" strokeweight="0">
               <v:imagedata r:id="rId9" o:title=""/>
             </v:shape>
-            <v:shape id="Graphic 5" o:spid="_x0000_s1029" style="position:absolute;left:64;top:64;width:55779;height:11582;visibility:visible;mso-wrap-style:square;v-text-anchor:top" coordsize="5577840,1158240" o:spt="100" o:gfxdata="" adj="0,,0" path="m,192912l5092,148717,19621,108077,42405,72262,72301,42418,108140,19558,148780,5080,193040,,5384800,r44195,5080l5469636,19558r35813,22860l5535421,72262r22734,35815l5572760,148717r5080,44195l5577840,964692r-5080,44323l5558155,1049528r-22734,35814l5505449,1115314r-35813,22733l5428995,1152652r-44195,5080l193040,1157732r-44260,-5080l108140,1138047,72301,1115314,42405,1085342,19621,1049528,5092,1009015,,964692,,192912xe" filled="f" strokecolor="#9f2b92" strokeweight=".35272mm">
+            <v:shape id="Graphic 5" o:spid="_x0000_s1029" style="position:absolute;left:64;top:64;width:55779;height:11582;visibility:visible;mso-wrap-style:square;v-text-anchor:top" coordsize="5577840,1158240" o:spt="100" adj="0,,0" path="m,192912l5092,148717,19621,108077,42405,72262,72301,42418,108140,19558,148780,5080,193040,,5384800,r44195,5080l5469636,19558r35813,22860l5535421,72262r22734,35815l5572760,148717r5080,44195l5577840,964692r-5080,44323l5558155,1049528r-22734,35814l5505449,1115314r-35813,22733l5428995,1152652r-44195,5080l193040,1157732r-44260,-5080l108140,1138047,72301,1115314,42405,1085342,19621,1049528,5092,1009015,,964692,,192912xe" filled="f" strokecolor="#9f2b92" strokeweight=".35272mm">
               <v:stroke joinstyle="round"/>
               <v:formulas/>
               <v:path arrowok="t" o:connecttype="segments" textboxrect="0,0,5578475,1158875"/>
             </v:shape>
-            <v:rect id="Textbox 6" o:spid="_x0000_s1030" style="position:absolute;width:55904;height:11710;visibility:visible;mso-wrap-style:square;v-text-anchor:top" o:gfxdata="" filled="f" stroked="f" strokeweight="0">
+            <v:rect id="Textbox 6" o:spid="_x0000_s1030" style="position:absolute;width:55904;height:11710;visibility:visible;mso-wrap-style:square;v-text-anchor:top" filled="f" stroked="f" strokeweight="0">
               <v:textbox inset="0,0,0,0">
                 <w:txbxContent>
                   <w:p>
@@ -718,41 +718,10 @@
         </w:rPr>
       </w:pPr>
     </w:p>
-    <w:p>
-      <w:pPr>
-        <w:pStyle w:val="BodyText"/>
-        <w:rPr>
-          <w:rFonts w:ascii="Trebuchet MS" w:hAnsi="Trebuchet MS"/>
-          <w:b/>
-          <w:sz w:val="20"/>
-        </w:rPr>
-      </w:pPr>
-    </w:p>
-    <w:p>
-      <w:pPr>
-        <w:pStyle w:val="BodyText"/>
-        <w:rPr>
-          <w:rFonts w:ascii="Trebuchet MS" w:hAnsi="Trebuchet MS"/>
-          <w:b/>
-          <w:sz w:val="20"/>
-        </w:rPr>
-      </w:pPr>
-    </w:p>
-    <w:p>
-      <w:pPr>
-        <w:pStyle w:val="BodyText"/>
-        <w:spacing w:before="104" w:after="1"/>
-        <w:rPr>
-          <w:rFonts w:ascii="Trebuchet MS" w:hAnsi="Trebuchet MS"/>
-          <w:b/>
-          <w:sz w:val="20"/>
-        </w:rPr>
-      </w:pPr>
-    </w:p>
     <w:tbl>
       <w:tblPr>
+        <w:tblpPr w:leftFromText="141" w:rightFromText="141" w:vertAnchor="text" w:horzAnchor="margin" w:tblpXSpec="center" w:tblpY="75"/>
         <w:tblW w:w="7006" w:type="dxa"/>
-        <w:tblInd w:w="899" w:type="dxa"/>
         <w:tblLayout w:type="fixed"/>
         <w:tblCellMar>
           <w:left w:w="2" w:type="dxa"/>
@@ -1182,6 +1151,7 @@
             <w:pPr>
               <w:pStyle w:val="TableParagraph"/>
               <w:rPr>
+                <w:spacing w:val="-4"/>
                 <w:sz w:val="24"/>
               </w:rPr>
             </w:pPr>
@@ -1223,7 +1193,7 @@
       </w:tr>
       <w:tr>
         <w:trPr>
-          <w:trHeight w:val="446"/>
+          <w:trHeight w:val="455"/>
         </w:trPr>
         <w:tc>
           <w:tcPr>
@@ -1279,7 +1249,7 @@
                 <w:spacing w:val="-2"/>
                 <w:sz w:val="24"/>
               </w:rPr>
-              <w:t>remise</w:t>
+              <w:t>soumission</w:t>
             </w:r>
           </w:p>
         </w:tc>
@@ -1296,7 +1266,6 @@
           <w:p>
             <w:pPr>
               <w:pStyle w:val="TableParagraph"/>
-              <w:ind w:left="453"/>
               <w:rPr>
                 <w:sz w:val="24"/>
               </w:rPr>
@@ -1305,27 +1274,19 @@
               <w:rPr>
                 <w:sz w:val="24"/>
               </w:rPr>
-              <w:t xml:space="preserve">05 </w:t>
+              <w:t>0</w:t>
             </w:r>
             <w:r>
               <w:rPr>
                 <w:sz w:val="24"/>
               </w:rPr>
-              <w:t>Août</w:t>
-            </w:r>
-            <w:r>
-              <w:rPr>
-                <w:spacing w:val="-12"/>
+              <w:t>3</w:t>
+            </w:r>
+            <w:r>
+              <w:rPr>
                 <w:sz w:val="24"/>
               </w:rPr>
-              <w:t xml:space="preserve"> </w:t>
-            </w:r>
-            <w:r>
-              <w:rPr>
-                <w:spacing w:val="-4"/>
-                <w:sz w:val="24"/>
-              </w:rPr>
-              <w:t>2026</w:t>
+              <w:t xml:space="preserve"> août 2026</w:t>
             </w:r>
           </w:p>
         </w:tc>
@@ -3665,6 +3626,13 @@
             </w:r>
             <w:r>
               <w:rPr>
+                <w:rStyle w:val="Hyperlink"/>
+                <w:noProof/>
+              </w:rPr>
+              <w:t xml:space="preserve"> </w:t>
+            </w:r>
+            <w:r>
+              <w:rPr>
                 <w:noProof/>
                 <w:webHidden/>
               </w:rPr>
@@ -4265,7 +4233,21 @@
                 <w:rStyle w:val="Hyperlink"/>
                 <w:noProof/>
               </w:rPr>
-              <w:t>mal, sans</w:t>
+              <w:t>mal</w:t>
+            </w:r>
+            <w:r>
+              <w:rPr>
+                <w:rStyle w:val="Hyperlink"/>
+                <w:noProof/>
+              </w:rPr>
+              <w:t xml:space="preserve"> </w:t>
+            </w:r>
+            <w:r>
+              <w:rPr>
+                <w:rStyle w:val="Hyperlink"/>
+                <w:noProof/>
+              </w:rPr>
+              <w:t>sans</w:t>
             </w:r>
             <w:r>
               <w:rPr>
@@ -6098,7 +6080,25 @@
         <w:t xml:space="preserve">ma </w:t>
       </w:r>
       <w:r>
-        <w:t>plateforme — celle que j’ai réellement déployée, cassée, réparée et documentée séance après séance, avec mes propres noms de ressources, mes propres captures d’écran et mes propres pannes. Il répond aux cinq parties demandées : la cartographie de ce que j’ai construit, le journal des choix techniques que j’ai dû trancher, une analyse des pannes silencieuses que j’ai moi-même provoquées, un test de la promesse « transposable tel quel vers le cloud », et enfin un jugement argumenté sur l’hébergement et la conformité des données sensibles d’Anfa.</w:t>
+        <w:t xml:space="preserve">plateforme </w:t>
+      </w:r>
+      <w:r>
+        <w:t>-</w:t>
+      </w:r>
+      <w:r>
+        <w:t xml:space="preserve"> celle que j’ai réellement déployée, cassée, réparée et documentée séance après séance</w:t>
+      </w:r>
+      <w:r>
+        <w:t xml:space="preserve"> </w:t>
+      </w:r>
+      <w:r>
+        <w:t>avec mes propres noms de ressources, mes propres captures d’écran et mes propres pannes. Il répond aux cinq parties demandées : la cartographie de ce que j’ai construit, le journal des choix techniques que j’ai dû trancher, une analyse des pannes silencieuses que j’ai moi-même provoquées, un test de la promesse « transposable tel quel vers le cloud »</w:t>
+      </w:r>
+      <w:r>
+        <w:t xml:space="preserve"> </w:t>
+      </w:r>
+      <w:r>
+        <w:t>et enfin un jugement argumenté sur l’hébergement et la conformité des données sensibles d’Anfa.</w:t>
       </w:r>
     </w:p>
     <w:p>
@@ -6236,7 +6236,13 @@
         <w:jc w:val="both"/>
       </w:pPr>
       <w:r>
-        <w:t>Tout part de quatre fichiers CSV : lignes.csv, arrets.csv, bus.csv, tarifs.csv — le référentiel de base d’Anfa (11 lignes, 92 arrêts, 99 bus, 11 tarifs). Depuis ce socle, la donnée traverse dix briques que j’ai assemblées une à une :</w:t>
+        <w:t xml:space="preserve">Tout part de quatre fichiers CSV : lignes.csv, arrets.csv, bus.csv, tarifs.csv </w:t>
+      </w:r>
+      <w:r>
+        <w:t>-</w:t>
+      </w:r>
+      <w:r>
+        <w:t xml:space="preserve"> le référentiel de base d’Anfa (11 lignes, 92 arrêts, 99 bus, 11 tarifs). Depuis ce socle, la donnée traverse dix briques que j’ai assemblées une à une :</w:t>
       </w:r>
     </w:p>
     <w:p>
@@ -6785,7 +6791,13 @@
         <w:jc w:val="both"/>
       </w:pPr>
       <w:r>
-        <w:t>Une capture par brique, prise dans mon propre environnement, avec mes propres noms de ressources (fichiers sources dans rapport-final/captures/). Chaque figure est insérée à la suite de</w:t>
+        <w:t>Une capture par brique, prise dans mon propre environnement</w:t>
+      </w:r>
+      <w:r>
+        <w:t xml:space="preserve"> </w:t>
+      </w:r>
+      <w:r>
+        <w:t>avec mes propres noms de ressources (fichiers sources dans rapport-final/captures/). Chaque figure est insérée à la suite de</w:t>
       </w:r>
       <w:r>
         <w:rPr>
@@ -6803,6 +6815,9 @@
         <w:spacing w:before="164" w:line="238" w:lineRule="auto"/>
         <w:ind w:left="141" w:right="141"/>
         <w:jc w:val="both"/>
+        <w:rPr>
+          <w:lang w:val="en-US"/>
+        </w:rPr>
       </w:pPr>
       <w:r>
         <w:rPr>
@@ -6840,7 +6855,7 @@
           <w:b/>
           <w:lang w:val="en-US"/>
         </w:rPr>
-        <w:t>—</w:t>
+        <w:t>-</w:t>
       </w:r>
       <w:r>
         <w:rPr>
@@ -6850,7 +6865,6 @@
         </w:rPr>
         <w:t xml:space="preserve"> </w:t>
       </w:r>
-      <w:proofErr w:type="spellStart"/>
       <w:r>
         <w:rPr>
           <w:b/>
@@ -6858,7 +6872,6 @@
         </w:rPr>
         <w:t>MinIO</w:t>
       </w:r>
-      <w:proofErr w:type="spellEnd"/>
       <w:r>
         <w:rPr>
           <w:b/>
@@ -7105,7 +7118,15 @@
           <w:sz w:val="24"/>
           <w:lang w:val="en-US"/>
         </w:rPr>
-        <w:t>— Docker</w:t>
+        <w:t>-</w:t>
+      </w:r>
+      <w:r>
+        <w:rPr>
+          <w:b/>
+          <w:sz w:val="24"/>
+          <w:lang w:val="en-US"/>
+        </w:rPr>
+        <w:t xml:space="preserve"> Docker</w:t>
       </w:r>
       <w:r>
         <w:rPr>
@@ -7389,7 +7410,7 @@
           <w:sz w:val="24"/>
           <w:lang w:val="en-US"/>
         </w:rPr>
-        <w:t>—</w:t>
+        <w:t>-</w:t>
       </w:r>
       <w:r>
         <w:rPr>
@@ -7649,7 +7670,7 @@
           <w:sz w:val="24"/>
           <w:lang w:val="en-US"/>
         </w:rPr>
-        <w:t>—</w:t>
+        <w:t>-</w:t>
       </w:r>
       <w:r>
         <w:rPr>
@@ -8027,7 +8048,7 @@
           <w:sz w:val="24"/>
           <w:lang w:val="en-US"/>
         </w:rPr>
-        <w:t>—</w:t>
+        <w:t>-</w:t>
       </w:r>
       <w:r>
         <w:rPr>
@@ -8366,7 +8387,7 @@
           <w:b/>
           <w:sz w:val="24"/>
         </w:rPr>
-        <w:t>—</w:t>
+        <w:t>-</w:t>
       </w:r>
       <w:r>
         <w:rPr>
@@ -8376,7 +8397,6 @@
         </w:rPr>
         <w:t xml:space="preserve"> </w:t>
       </w:r>
-      <w:proofErr w:type="spellStart"/>
       <w:r>
         <w:rPr>
           <w:b/>
@@ -8384,7 +8404,6 @@
         </w:rPr>
         <w:t>Airflow</w:t>
       </w:r>
-      <w:proofErr w:type="spellEnd"/>
       <w:r>
         <w:rPr>
           <w:b/>
@@ -8599,7 +8618,7 @@
           <w:sz w:val="24"/>
           <w:lang w:val="en-US"/>
         </w:rPr>
-        <w:t>—</w:t>
+        <w:t>-</w:t>
       </w:r>
       <w:r>
         <w:rPr>
@@ -8905,7 +8924,23 @@
           <w:sz w:val="24"/>
           <w:lang w:val="en-US"/>
         </w:rPr>
-        <w:t>e 8 — C</w:t>
+        <w:t xml:space="preserve">e 8 </w:t>
+      </w:r>
+      <w:r>
+        <w:rPr>
+          <w:b/>
+          <w:sz w:val="24"/>
+          <w:lang w:val="en-US"/>
+        </w:rPr>
+        <w:t>-</w:t>
+      </w:r>
+      <w:r>
+        <w:rPr>
+          <w:b/>
+          <w:sz w:val="24"/>
+          <w:lang w:val="en-US"/>
+        </w:rPr>
+        <w:t xml:space="preserve"> C</w:t>
       </w:r>
       <w:r>
         <w:rPr>
@@ -9511,7 +9546,7 @@
           <w:sz w:val="24"/>
           <w:lang w:val="en-US"/>
         </w:rPr>
-        <w:t>—</w:t>
+        <w:t>-</w:t>
       </w:r>
       <w:r>
         <w:rPr>
@@ -9801,6 +9836,7 @@
           <w:b/>
           <w:spacing w:val="-2"/>
           <w:sz w:val="24"/>
+          <w:lang w:val="en-US"/>
         </w:rPr>
         <w:t>Figure</w:t>
       </w:r>
@@ -9808,6 +9844,7 @@
         <w:rPr>
           <w:b/>
           <w:sz w:val="24"/>
+          <w:lang w:val="en-US"/>
         </w:rPr>
         <w:t xml:space="preserve"> </w:t>
       </w:r>
@@ -9816,6 +9853,7 @@
           <w:b/>
           <w:spacing w:val="-6"/>
           <w:sz w:val="24"/>
+          <w:lang w:val="en-US"/>
         </w:rPr>
         <w:t>10</w:t>
       </w:r>
@@ -9823,23 +9861,40 @@
         <w:rPr>
           <w:b/>
           <w:sz w:val="24"/>
-        </w:rPr>
-        <w:t xml:space="preserve"> — </w:t>
-      </w:r>
-      <w:proofErr w:type="spellStart"/>
+          <w:lang w:val="en-US"/>
+        </w:rPr>
+        <w:t xml:space="preserve"> </w:t>
+      </w:r>
+      <w:r>
+        <w:rPr>
+          <w:b/>
+          <w:sz w:val="24"/>
+          <w:lang w:val="en-US"/>
+        </w:rPr>
+        <w:t>-</w:t>
+      </w:r>
+      <w:r>
+        <w:rPr>
+          <w:b/>
+          <w:sz w:val="24"/>
+          <w:lang w:val="en-US"/>
+        </w:rPr>
+        <w:t xml:space="preserve"> </w:t>
+      </w:r>
       <w:r>
         <w:rPr>
           <w:b/>
           <w:spacing w:val="-4"/>
           <w:sz w:val="24"/>
+          <w:lang w:val="en-US"/>
         </w:rPr>
         <w:t>MLOps</w:t>
       </w:r>
-      <w:proofErr w:type="spellEnd"/>
-      <w:r>
-        <w:rPr>
-          <w:b/>
-          <w:sz w:val="24"/>
+      <w:r>
+        <w:rPr>
+          <w:b/>
+          <w:sz w:val="24"/>
+          <w:lang w:val="en-US"/>
         </w:rPr>
         <w:t xml:space="preserve"> </w:t>
       </w:r>
@@ -9848,6 +9903,7 @@
           <w:b/>
           <w:spacing w:val="-2"/>
           <w:sz w:val="24"/>
+          <w:lang w:val="en-US"/>
         </w:rPr>
         <w:t>(S10).</w:t>
       </w:r>
@@ -9855,6 +9911,7 @@
         <w:rPr>
           <w:b/>
           <w:sz w:val="24"/>
+          <w:lang w:val="en-US"/>
         </w:rPr>
         <w:t xml:space="preserve"> </w:t>
       </w:r>
@@ -9871,37 +9928,12 @@
         </w:rPr>
         <w:t xml:space="preserve"> </w:t>
       </w:r>
-      <w:proofErr w:type="spellStart"/>
       <w:r>
         <w:rPr>
           <w:spacing w:val="-2"/>
           <w:sz w:val="24"/>
         </w:rPr>
-        <w:t>anfa</w:t>
-      </w:r>
-      <w:proofErr w:type="spellEnd"/>
-      <w:r>
-        <w:rPr>
-          <w:spacing w:val="-2"/>
-          <w:sz w:val="24"/>
-        </w:rPr>
-        <w:t>-</w:t>
-      </w:r>
-      <w:proofErr w:type="spellStart"/>
-      <w:r>
-        <w:rPr>
-          <w:spacing w:val="-2"/>
-          <w:sz w:val="24"/>
-        </w:rPr>
-        <w:t>prediction</w:t>
-      </w:r>
-      <w:proofErr w:type="spellEnd"/>
-      <w:r>
-        <w:rPr>
-          <w:spacing w:val="-2"/>
-          <w:sz w:val="24"/>
-        </w:rPr>
-        <w:t>-affluence</w:t>
+        <w:t>anfa-prediction-affluence</w:t>
       </w:r>
       <w:r>
         <w:rPr>
@@ -9933,21 +9965,7 @@
         <w:rPr>
           <w:sz w:val="24"/>
         </w:rPr>
-        <w:t xml:space="preserve">Production dans le </w:t>
-      </w:r>
-      <w:proofErr w:type="spellStart"/>
-      <w:r>
-        <w:rPr>
-          <w:sz w:val="24"/>
-        </w:rPr>
-        <w:t>Registry</w:t>
-      </w:r>
-      <w:proofErr w:type="spellEnd"/>
-      <w:r>
-        <w:rPr>
-          <w:sz w:val="24"/>
-        </w:rPr>
-        <w:t>.</w:t>
+        <w:t>Production dans le Registry.</w:t>
       </w:r>
     </w:p>
     <w:p>
@@ -10053,7 +10071,7 @@
         <w:t xml:space="preserve"> </w:t>
       </w:r>
       <w:r>
-        <w:t>—</w:t>
+        <w:t>-</w:t>
       </w:r>
       <w:r>
         <w:rPr>
@@ -10104,7 +10122,7 @@
         <w:t xml:space="preserve"> </w:t>
       </w:r>
       <w:r>
-        <w:t>le semestre,</w:t>
+        <w:t>le semestre</w:t>
       </w:r>
       <w:r>
         <w:rPr>
@@ -10306,8 +10324,13 @@
         <w:t xml:space="preserve"> </w:t>
       </w:r>
       <w:r>
-        <w:t>(Kubernetes</w:t>
-      </w:r>
+        <w:t>(</w:t>
+      </w:r>
+      <w:proofErr w:type="spellStart"/>
+      <w:r>
+        <w:t>Kubernetes</w:t>
+      </w:r>
+      <w:proofErr w:type="spellEnd"/>
       <w:r>
         <w:rPr>
           <w:spacing w:val="-5"/>
@@ -10324,7 +10347,13 @@
         <w:t xml:space="preserve"> </w:t>
       </w:r>
       <w:r>
-        <w:t>Docker), où chaque nœud est lui-même un conteneur Docker.</w:t>
+        <w:t>Docker)</w:t>
+      </w:r>
+      <w:r>
+        <w:t xml:space="preserve"> </w:t>
+      </w:r>
+      <w:r>
+        <w:t>où chaque nœud est lui-même un conteneur Docker.</w:t>
       </w:r>
     </w:p>
     <w:p>
@@ -10354,12 +10383,9 @@
         <w:t xml:space="preserve">écartée. </w:t>
       </w:r>
       <w:r>
-        <w:t>Minikube,</w:t>
-      </w:r>
-      <w:r>
-        <w:rPr>
-          <w:spacing w:val="-1"/>
-        </w:rPr>
+        <w:t>Minikube</w:t>
+      </w:r>
+      <w:r>
         <w:t xml:space="preserve"> </w:t>
       </w:r>
       <w:r>
@@ -10461,7 +10487,7 @@
         <w:t xml:space="preserve">Ce qui casserait à l’inverse. </w:t>
       </w:r>
       <w:r>
-        <w:t>Avec Minikube, l’accès réseau depuis l’hôte est parfois plus direct selon le driver choisi, mais le modèle mental « les nœuds K8s sont des conteneurs Docker » aurait été moins évident. Kind reste aussi plus léger à instancier/détruire en boucle pendant un</w:t>
+        <w:t>Avec Minikube, l’accès réseau depuis l’hôte est parfois plus direct selon le driver choisi mais le modèle mental « les nœuds K8s sont des conteneurs Docker » aurait été moins évident. Kind reste aussi plus léger à instancier/détruire en boucle pendant un</w:t>
       </w:r>
       <w:r>
         <w:rPr>
@@ -10594,6 +10620,7 @@
         <w:pStyle w:val="BodyText"/>
         <w:spacing w:before="168" w:line="238" w:lineRule="auto"/>
         <w:ind w:left="141"/>
+        <w:jc w:val="both"/>
       </w:pPr>
       <w:r>
         <w:rPr>
@@ -10681,7 +10708,21 @@
         <w:t xml:space="preserve"> </w:t>
       </w:r>
       <w:r>
-        <w:t>communautaire kreuzwerker/docker, qui pilote un démon Docker local plutôt qu’une API cloud.</w:t>
+        <w:t xml:space="preserve">communautaire </w:t>
+      </w:r>
+      <w:proofErr w:type="spellStart"/>
+      <w:r>
+        <w:t>kreuzwerker</w:t>
+      </w:r>
+      <w:proofErr w:type="spellEnd"/>
+      <w:r>
+        <w:t>/docker</w:t>
+      </w:r>
+      <w:r>
+        <w:t xml:space="preserve"> </w:t>
+      </w:r>
+      <w:r>
+        <w:t>qui pilote un démon Docker local plutôt qu’une API cloud.</w:t>
       </w:r>
     </w:p>
     <w:p>
@@ -10823,7 +10864,19 @@
         <w:t xml:space="preserve">Ce qui casserait à l’inverse. </w:t>
       </w:r>
       <w:r>
-        <w:t xml:space="preserve">Un provider cloud m’aurait obligé à créer un compte, une carte bancaire, et à gérer des identifiants API dès la séance 4 — alors que l’objectif pédagogique de cette séance est le </w:t>
+        <w:t>Un provider cloud m’aurait obligé à créer un compte, une carte bancaire</w:t>
+      </w:r>
+      <w:r>
+        <w:t xml:space="preserve"> </w:t>
+      </w:r>
+      <w:r>
+        <w:t xml:space="preserve">et à gérer des identifiants API dès la séance 4 </w:t>
+      </w:r>
+      <w:r>
+        <w:t>-</w:t>
+      </w:r>
+      <w:r>
+        <w:t xml:space="preserve"> alors que l’objectif pédagogique de cette séance est le </w:t>
       </w:r>
       <w:r>
         <w:rPr>
@@ -10832,7 +10885,13 @@
         <w:t xml:space="preserve">workflow </w:t>
       </w:r>
       <w:r>
-        <w:t>Terraform (init/plan/apply/destroy, state, variables), pas la relation avec un cloud précis. Le mécanisme reste rigoureusement identique : mon main.tf se transposerait resource par resource vers un équivalent cloud. Ce que j’aurais perdu avec un provider cloud local uniquement : rien côté apprentissage Terraform, mais un vrai risque financier si j’avais mal géré le terraform destroy</w:t>
+        <w:t>Terraform (init/plan/apply/destroy, state, variables), pas la relation avec un cloud précis. Le mécanisme reste rigoureusement identique : mon main.tf se transposerait resource par resource vers un équivalent cloud. Ce que j’aurais perdu avec un provider cloud local uniquement : rien côté apprentissage Terraform</w:t>
+      </w:r>
+      <w:r>
+        <w:t xml:space="preserve"> </w:t>
+      </w:r>
+      <w:r>
+        <w:t>mais un vrai risque financier si j’avais mal géré le terraform destroy</w:t>
       </w:r>
       <w:r>
         <w:rPr>
@@ -10841,7 +10900,13 @@
         <w:t xml:space="preserve"> </w:t>
       </w:r>
       <w:r>
-        <w:t>en fin de séance — avec le provider Docker, une ressource</w:t>
+        <w:t xml:space="preserve">en fin de séance </w:t>
+      </w:r>
+      <w:r>
+        <w:t>-</w:t>
+      </w:r>
+      <w:r>
+        <w:t xml:space="preserve"> avec le provider Docker, une ressource</w:t>
       </w:r>
       <w:r>
         <w:rPr>
@@ -11110,7 +11175,19 @@
         <w:t xml:space="preserve"> </w:t>
       </w:r>
       <w:r>
-        <w:t>l’image Airflow (driver) et la version du cluster Spark (apache/spark:3.5.8) — couplage qui a provoqué mon troisième bug (InvalidClassException, désalignement 3.5.0 vs 3.5.8). À l’inverse, monter le socket Docker dans Airflow expose le démon Docker de l’hôte au conteneur Airflow — un vecteur d’attaque plus large en cas de compromission d’un DAG. Mon image custom n’a pas ce problème. Les deux approches ont</w:t>
+        <w:t xml:space="preserve">l’image Airflow (driver) et la version du cluster Spark (apache/spark:3.5.8) </w:t>
+      </w:r>
+      <w:r>
+        <w:t>-</w:t>
+      </w:r>
+      <w:r>
+        <w:t xml:space="preserve"> couplage qui a provoqué mon troisième bug (InvalidClassException, désalignement 3.5.0 vs 3.5.8). À l’inverse, monter le socket Docker dans Airflow expose le démon Docker de l’hôte au conteneur Airflow </w:t>
+      </w:r>
+      <w:r>
+        <w:t>-</w:t>
+      </w:r>
+      <w:r>
+        <w:t xml:space="preserve"> un vecteur d’attaque plus large en cas de compromission d’un DAG. Mon image custom n’a pas ce problème. Les deux approches ont</w:t>
       </w:r>
       <w:r>
         <w:rPr>
@@ -11119,7 +11196,7 @@
         <w:t xml:space="preserve"> </w:t>
       </w:r>
       <w:r>
-        <w:t>donc un vrai compromis : couplage de version contre surface d’attaque élargie. Je retiendrais la mienne en production, mais en épinglant la version pyspark de façon disciplinée dès le départ plutôt qu’après un incident.</w:t>
+        <w:t>donc un vrai compromis : couplage de version contre surface d’attaque élargie. Je retiendrais la mienne en production mais en épinglant la version pyspark de façon disciplinée dès le départ plutôt qu’après un incident.</w:t>
       </w:r>
     </w:p>
     <w:p>
@@ -11258,7 +11335,15 @@
         <w:t xml:space="preserve">Alternative écartée. </w:t>
       </w:r>
       <w:r>
-        <w:t>Tester la logique directement à l’intérieur des PythonOperator du DAG, en important Airflow dans les tests (ou en ne testant rien du tout, comme c’était le cas avant la séance 8).</w:t>
+        <w:t xml:space="preserve">Tester la logique directement à l’intérieur des </w:t>
+      </w:r>
+      <w:proofErr w:type="spellStart"/>
+      <w:r>
+        <w:t>PythonOperator</w:t>
+      </w:r>
+      <w:proofErr w:type="spellEnd"/>
+      <w:r>
+        <w:t xml:space="preserve"> du DAG en important Airflow dans les tests (ou en ne testant rien du tout, comme c’était le cas avant la séance 8).</w:t>
       </w:r>
     </w:p>
     <w:p>
@@ -11632,6 +11717,9 @@
         <w:spacing w:before="171"/>
         <w:ind w:left="141" w:right="146"/>
         <w:jc w:val="both"/>
+        <w:rPr>
+          <w:spacing w:val="23"/>
+        </w:rPr>
       </w:pPr>
       <w:r>
         <w:rPr>
@@ -11640,7 +11728,13 @@
         <w:t xml:space="preserve">Décision. </w:t>
       </w:r>
       <w:r>
-        <w:t>Simuler une panne silencieuse du pipeline Anfa en laissant l’exportateur de fraîcheur tourner, mais en gelant la mise à jour de sa métrique via un fichier sentinelle (/tmp/anfa_en_panne)</w:t>
+        <w:t>Simuler une panne silencieuse du pipeline Anfa en laissant l’exportateur de fraîcheur tourner</w:t>
+      </w:r>
+      <w:r>
+        <w:t xml:space="preserve"> </w:t>
+      </w:r>
+      <w:r>
+        <w:t>mais en gelant la mise à jour de sa métrique via un fichier sentinelle (/tmp/anfa_en_panne)</w:t>
       </w:r>
       <w:r>
         <w:rPr>
@@ -11692,75 +11786,98 @@
           <w:spacing w:val="23"/>
         </w:rPr>
         <w:t xml:space="preserve"> </w:t>
-      </w:r>
-      <w:r>
-        <w:rPr>
-          <w:b/>
-        </w:rPr>
-        <w:t>Alternative</w:t>
-      </w:r>
-      <w:r>
-        <w:rPr>
-          <w:b/>
-          <w:spacing w:val="8"/>
-        </w:rPr>
-        <w:t xml:space="preserve"> </w:t>
-      </w:r>
-      <w:r>
-        <w:rPr>
-          <w:b/>
-        </w:rPr>
-        <w:t>écartée.</w:t>
-      </w:r>
-      <w:r>
-        <w:rPr>
-          <w:b/>
-          <w:spacing w:val="12"/>
-        </w:rPr>
-        <w:t xml:space="preserve"> </w:t>
-      </w:r>
-      <w:r>
-        <w:t>docker</w:t>
-      </w:r>
-      <w:r>
-        <w:rPr>
-          <w:spacing w:val="10"/>
-        </w:rPr>
-        <w:t xml:space="preserve"> </w:t>
-      </w:r>
-      <w:r>
-        <w:t>stop</w:t>
-      </w:r>
-      <w:r>
-        <w:rPr>
-          <w:spacing w:val="14"/>
-        </w:rPr>
-        <w:t xml:space="preserve"> </w:t>
-      </w:r>
-      <w:r>
-        <w:rPr>
-          <w:spacing w:val="-2"/>
-        </w:rPr>
-        <w:t>anfa-</w:t>
       </w:r>
     </w:p>
     <w:p>
       <w:pPr>
         <w:pStyle w:val="BodyText"/>
+        <w:spacing w:before="171"/>
+        <w:ind w:left="141" w:right="146"/>
         <w:jc w:val="both"/>
-      </w:pPr>
-    </w:p>
-    <w:p>
-      <w:pPr>
-        <w:pStyle w:val="BodyText"/>
-        <w:spacing w:before="71"/>
-        <w:ind w:left="141"/>
-      </w:pPr>
+        <w:rPr>
+          <w:lang w:val="en-US"/>
+        </w:rPr>
+      </w:pPr>
+      <w:r>
+        <w:rPr>
+          <w:b/>
+          <w:lang w:val="en-US"/>
+        </w:rPr>
+        <w:t>Alternative</w:t>
+      </w:r>
+      <w:r>
+        <w:rPr>
+          <w:b/>
+          <w:spacing w:val="8"/>
+          <w:lang w:val="en-US"/>
+        </w:rPr>
+        <w:t xml:space="preserve"> </w:t>
+      </w:r>
+      <w:proofErr w:type="spellStart"/>
+      <w:r>
+        <w:rPr>
+          <w:b/>
+          <w:lang w:val="en-US"/>
+        </w:rPr>
+        <w:t>écartée</w:t>
+      </w:r>
+      <w:proofErr w:type="spellEnd"/>
+      <w:r>
+        <w:rPr>
+          <w:b/>
+          <w:lang w:val="en-US"/>
+        </w:rPr>
+        <w:t>.</w:t>
+      </w:r>
+      <w:r>
+        <w:rPr>
+          <w:b/>
+          <w:spacing w:val="12"/>
+          <w:lang w:val="en-US"/>
+        </w:rPr>
+        <w:t xml:space="preserve"> </w:t>
+      </w:r>
+      <w:r>
+        <w:rPr>
+          <w:lang w:val="en-US"/>
+        </w:rPr>
+        <w:t>docker</w:t>
+      </w:r>
+      <w:r>
+        <w:rPr>
+          <w:spacing w:val="10"/>
+          <w:lang w:val="en-US"/>
+        </w:rPr>
+        <w:t xml:space="preserve"> </w:t>
+      </w:r>
+      <w:r>
+        <w:rPr>
+          <w:lang w:val="en-US"/>
+        </w:rPr>
+        <w:t>stop</w:t>
+      </w:r>
+      <w:r>
+        <w:rPr>
+          <w:spacing w:val="14"/>
+          <w:lang w:val="en-US"/>
+        </w:rPr>
+        <w:t xml:space="preserve"> </w:t>
+      </w:r>
+      <w:proofErr w:type="spellStart"/>
       <w:r>
         <w:rPr>
           <w:spacing w:val="-2"/>
-        </w:rPr>
-        <w:t>freshness-exporter.</w:t>
+          <w:lang w:val="en-US"/>
+        </w:rPr>
+        <w:t>anfa</w:t>
+      </w:r>
+      <w:proofErr w:type="spellEnd"/>
+      <w:r>
+        <w:rPr>
+          <w:spacing w:val="-2"/>
+          <w:lang w:val="en-US"/>
+        </w:rPr>
+        <w:t>-freshness-exporter.</w:t>
       </w:r>
     </w:p>
     <w:p>
@@ -12235,7 +12352,7 @@
           <w:noProof/>
         </w:rPr>
         <w:pict w14:anchorId="54278816">
-          <v:shape id="Graphic 19" o:spid="_x0000_s1026" style="position:absolute;left:0;text-align:left;margin-left:70.85pt;margin-top:16.4pt;width:3.15pt;height:1.2pt;z-index:18;visibility:visible;mso-wrap-style:square;mso-wrap-distance-left:0;mso-wrap-distance-top:0;mso-wrap-distance-right:0;mso-wrap-distance-bottom:0;mso-position-horizontal:absolute;mso-position-horizontal-relative:page;mso-position-vertical:absolute;mso-position-vertical-relative:text;v-text-anchor:top" coordsize="40005,15240" o:spt="100" o:gfxdata="" o:allowincell="f" adj="0,,0" path="m39624,l,,,15240r39624,l39624,xe" fillcolor="black" stroked="f" strokeweight="0">
+          <v:shape id="Graphic 19" o:spid="_x0000_s1026" style="position:absolute;left:0;text-align:left;margin-left:70.85pt;margin-top:16.4pt;width:3.15pt;height:1.2pt;z-index:18;visibility:visible;mso-wrap-style:square;mso-wrap-distance-left:0;mso-wrap-distance-top:0;mso-wrap-distance-right:0;mso-wrap-distance-bottom:0;mso-position-horizontal:absolute;mso-position-horizontal-relative:page;mso-position-vertical:absolute;mso-position-vertical-relative:text;v-text-anchor:top" coordsize="40005,15240" o:spt="100" o:allowincell="f" adj="0,,0" path="m39624,l,,,15240r39624,l39624,xe" fillcolor="black" stroked="f" strokeweight="0">
             <v:stroke joinstyle="round"/>
             <v:formulas/>
             <v:path arrowok="t" o:connecttype="segments" textboxrect="0,0,40640,15875"/>
@@ -12253,7 +12370,10 @@
         <w:t xml:space="preserve"> </w:t>
       </w:r>
       <w:r>
-        <w:t>3 —</w:t>
+        <w:t xml:space="preserve">3 </w:t>
+      </w:r>
+      <w:r>
+        <w:t>-</w:t>
       </w:r>
       <w:r>
         <w:rPr>
@@ -12407,13 +12527,7 @@
         <w:t xml:space="preserve"> </w:t>
       </w:r>
       <w:r>
-        <w:t>—</w:t>
-      </w:r>
-      <w:r>
-        <w:rPr>
-          <w:spacing w:val="22"/>
-        </w:rPr>
-        <w:t xml:space="preserve"> </w:t>
+        <w:t xml:space="preserve">- </w:t>
       </w:r>
       <w:r>
         <w:t>Airflow</w:t>
@@ -12537,20 +12651,20 @@
         <w:jc w:val="both"/>
       </w:pPr>
       <w:r>
-        <w:t xml:space="preserve">J’ai injecté un bug volontaire dans la tâche verifier_resultats de mon DAG anfa_pipeline_quotidien (raise ValueError si le bucket anfa-processed/heures_de_pointe/ est </w:t>
+        <w:t>J’ai injecté un bug volontaire dans la tâche verifier_resultats de mon DAG anfa_pipeline_quotidien (raise ValueError si le bucket anfa-processed/heures_de_pointe/ est vide). Résultat observé dans l’UI Airflow : la</w:t>
+      </w:r>
+      <w:r>
+        <w:rPr>
+          <w:spacing w:val="40"/>
+        </w:rPr>
+        <w:t xml:space="preserve"> </w:t>
+      </w:r>
+      <w:r>
+        <w:t xml:space="preserve">tâche verifier_resultats passe au rouge, et notifier </w:t>
       </w:r>
       <w:r>
         <w:lastRenderedPageBreak/>
-        <w:t>vide). Résultat observé dans l’UI Airflow : la</w:t>
-      </w:r>
-      <w:r>
-        <w:rPr>
-          <w:spacing w:val="40"/>
-        </w:rPr>
-        <w:t xml:space="preserve"> </w:t>
-      </w:r>
-      <w:r>
-        <w:t xml:space="preserve">tâche verifier_resultats passe au rouge, et notifier passe à l’orange (upstream_failed) au lieu de s’exécuter aveuglément. C’est le comportement voulu - mais ce qui compte ici, c’est ce qui se serait passé </w:t>
+        <w:t xml:space="preserve">passe à l’orange (upstream_failed) au lieu de s’exécuter aveuglément. C’est le comportement voulu - mais ce qui compte ici, c’est ce qui se serait passé </w:t>
       </w:r>
       <w:r>
         <w:rPr>
@@ -12613,7 +12727,7 @@
         <w:t xml:space="preserve"> </w:t>
       </w:r>
       <w:r>
-        <w:t>—</w:t>
+        <w:t>-</w:t>
       </w:r>
       <w:r>
         <w:rPr>
@@ -12808,6 +12922,7 @@
         </w:tabs>
         <w:spacing w:before="67" w:line="235" w:lineRule="auto"/>
         <w:ind w:right="667"/>
+        <w:jc w:val="both"/>
       </w:pPr>
       <w:bookmarkStart w:id="38" w:name="3.1__Panne_3_-_MLOps_%3A_un_modèle_qui_r"/>
       <w:bookmarkStart w:id="39" w:name="_Toc236415593"/>
@@ -12832,7 +12947,7 @@
         <w:t xml:space="preserve"> </w:t>
       </w:r>
       <w:r>
-        <w:t>—</w:t>
+        <w:t>-</w:t>
       </w:r>
       <w:r>
         <w:rPr>
@@ -12931,7 +13046,13 @@
         <w:t xml:space="preserve"> </w:t>
       </w:r>
       <w:r>
-        <w:t>mal, sans</w:t>
+        <w:t>mal</w:t>
+      </w:r>
+      <w:r>
+        <w:t xml:space="preserve"> </w:t>
+      </w:r>
+      <w:r>
+        <w:t>sans</w:t>
       </w:r>
       <w:r>
         <w:rPr>
@@ -12970,7 +13091,13 @@
         <w:jc w:val="both"/>
       </w:pPr>
       <w:r>
-        <w:t>Pour vérifier concrètement le problème de Kossi (CM séance 10 — son modèle de prédiction d’affluence se trompe de plus en plus depuis l’ouverture de 2 nouvelles lignes en avril, « rien ne plante, tout est vert »), j’ai reproduit ce scénario sur mon propre</w:t>
+        <w:t xml:space="preserve">Pour vérifier concrètement le problème de Kossi (CM séance 10 </w:t>
+      </w:r>
+      <w:r>
+        <w:t>-</w:t>
+      </w:r>
+      <w:r>
+        <w:t xml:space="preserve"> son modèle de prédiction d’affluence se trompe de plus en plus depuis l’ouverture de 2 nouvelles lignes en avril, « rien ne plante, tout est vert »), j’ai reproduit ce scénario sur mon propre</w:t>
       </w:r>
       <w:r>
         <w:rPr>
@@ -13069,7 +13196,7 @@
         <w:t xml:space="preserve"> </w:t>
       </w:r>
       <w:r>
-        <w:t>sur deux jeux de données : un jeu « baseline » avec les 12 lignes connues à l’entraînement, et un jeu simulant l’ouverture de 2 nouvelles lignes (L13, L14) jamais vues par le modèle.</w:t>
+        <w:t>sur deux jeux de données : un jeu « baseline » avec les 12 lignes connues à l’entraînement et un jeu simulant l’ouverture de 2 nouvelles lignes (L13, L14) jamais vues par le modèle.</w:t>
       </w:r>
     </w:p>
     <w:p>
@@ -13569,11 +13696,11 @@
         <w:t xml:space="preserve"> </w:t>
       </w:r>
       <w:r>
-        <w:t xml:space="preserve">échouer la prédiction : le modèle continue de répondre, juste de moins en moins bien. J’ai loggé ce run de comparaison dans MLflow </w:t>
+        <w:t xml:space="preserve">échouer la prédiction : le modèle continue de répondre, juste de moins en moins bien. J’ai loggé ce run de comparaison dans MLflow (monitoring-drift-ouverture-L13-L14, 5 métriques) pour qu’il soit consultable comme n’importe </w:t>
       </w:r>
       <w:r>
         <w:lastRenderedPageBreak/>
-        <w:t>(monitoring-drift-ouverture-L13-L14, 5 métriques) pour qu’il soit consultable comme n’importe quel autre run - capture 10-mlflow-drift-monitoring.png.</w:t>
+        <w:t>quel autre run - capture 10-mlflow-drift-monitoring.png.</w:t>
       </w:r>
     </w:p>
     <w:p>
@@ -14034,7 +14161,7 @@
         <w:t xml:space="preserve"> </w:t>
       </w:r>
       <w:r>
-        <w:t>—</w:t>
+        <w:t>-</w:t>
       </w:r>
       <w:r>
         <w:rPr>
@@ -14168,20 +14295,20 @@
         <w:t xml:space="preserve"> </w:t>
       </w:r>
       <w:r>
-        <w:t>la place de mes clés applicatives anfa-app-</w:t>
+        <w:t>la place de mes clés applicatives anfa-app-key. Les noms de bucket (anfa-raw,</w:t>
+      </w:r>
+      <w:r>
+        <w:rPr>
+          <w:spacing w:val="40"/>
+        </w:rPr>
+        <w:t xml:space="preserve"> </w:t>
+      </w:r>
+      <w:r>
+        <w:t xml:space="preserve">anfa-processed, anfa-streaming) et la structure en préfixes </w:t>
       </w:r>
       <w:r>
         <w:lastRenderedPageBreak/>
-        <w:t>key. Les noms de bucket (anfa-raw,</w:t>
-      </w:r>
-      <w:r>
-        <w:rPr>
-          <w:spacing w:val="40"/>
-        </w:rPr>
-        <w:t xml:space="preserve"> </w:t>
-      </w:r>
-      <w:r>
-        <w:t>anfa-processed, anfa-streaming) et la structure en préfixes restent identiques. Ce</w:t>
+        <w:t>restent identiques. Ce</w:t>
       </w:r>
       <w:r>
         <w:rPr>
@@ -15347,7 +15474,7 @@
         <w:t xml:space="preserve"> </w:t>
       </w:r>
       <w:r>
-        <w:t>—</w:t>
+        <w:t>-</w:t>
       </w:r>
       <w:r>
         <w:rPr>
@@ -15414,7 +15541,7 @@
         <w:jc w:val="both"/>
       </w:pPr>
       <w:r>
-        <w:t xml:space="preserve">La future application mobile Anfa collecterait, pour chaque passager : sa </w:t>
+        <w:t xml:space="preserve">La future application mobile Anfa collecterait pour chaque passager : sa </w:t>
       </w:r>
       <w:r>
         <w:rPr>
@@ -15562,7 +15689,7 @@
         <w:t xml:space="preserve"> </w:t>
       </w:r>
       <w:r>
-        <w:t xml:space="preserve">de l’abonnement), et son </w:t>
+        <w:t xml:space="preserve">de l’abonnement) et son </w:t>
       </w:r>
       <w:r>
         <w:rPr>
@@ -15760,7 +15887,10 @@
         <w:t xml:space="preserve"> </w:t>
       </w:r>
       <w:r>
-        <w:t>— le texte</w:t>
+        <w:t>-</w:t>
+      </w:r>
+      <w:r>
+        <w:t xml:space="preserve"> le texte</w:t>
       </w:r>
       <w:r>
         <w:rPr>
@@ -15995,7 +16125,13 @@
         <w:t xml:space="preserve"> </w:t>
       </w:r>
       <w:r>
-        <w:t>simultanément — ce n’est pas un détail, c’est une contrainte structurante sur la conception du pipeline.</w:t>
+        <w:t xml:space="preserve">simultanément </w:t>
+      </w:r>
+      <w:r>
+        <w:t>-</w:t>
+      </w:r>
+      <w:r>
+        <w:t xml:space="preserve"> ce n’est pas un détail, c’est une contrainte structurante sur la conception du pipeline.</w:t>
       </w:r>
     </w:p>
     <w:p>
@@ -16326,7 +16462,13 @@
         <w:t xml:space="preserve"> </w:t>
       </w:r>
       <w:r>
-        <w:t>tourner —</w:t>
+        <w:t xml:space="preserve">tourner </w:t>
+      </w:r>
+      <w:r>
+        <w:t xml:space="preserve">- </w:t>
+      </w:r>
+      <w:r>
+        <w:t>c’est le nombre</w:t>
       </w:r>
       <w:r>
         <w:rPr>
@@ -16335,7 +16477,16 @@
         <w:t xml:space="preserve"> </w:t>
       </w:r>
       <w:r>
-        <w:t>c’est le nombre</w:t>
+        <w:t>de fois</w:t>
+      </w:r>
+      <w:r>
+        <w:rPr>
+          <w:spacing w:val="-5"/>
+        </w:rPr>
+        <w:t xml:space="preserve"> </w:t>
+      </w:r>
+      <w:r>
+        <w:t>où</w:t>
       </w:r>
       <w:r>
         <w:rPr>
@@ -16344,7 +16495,25 @@
         <w:t xml:space="preserve"> </w:t>
       </w:r>
       <w:r>
-        <w:t>de fois</w:t>
+        <w:t>le même</w:t>
+      </w:r>
+      <w:r>
+        <w:rPr>
+          <w:spacing w:val="-3"/>
+        </w:rPr>
+        <w:t xml:space="preserve"> </w:t>
+      </w:r>
+      <w:r>
+        <w:t>principe est revenu sous une forme différente : garder une</w:t>
+      </w:r>
+      <w:r>
+        <w:rPr>
+          <w:spacing w:val="-2"/>
+        </w:rPr>
+        <w:t xml:space="preserve"> </w:t>
+      </w:r>
+      <w:r>
+        <w:t>trace plutôt que présumer (Git, Terraform</w:t>
       </w:r>
       <w:r>
         <w:rPr>
@@ -16353,25 +16522,25 @@
         <w:t xml:space="preserve"> </w:t>
       </w:r>
       <w:r>
-        <w:t>où</w:t>
-      </w:r>
-      <w:r>
-        <w:rPr>
-          <w:spacing w:val="-3"/>
-        </w:rPr>
-        <w:t xml:space="preserve"> </w:t>
-      </w:r>
-      <w:r>
-        <w:t>le même</w:t>
-      </w:r>
-      <w:r>
-        <w:rPr>
-          <w:spacing w:val="-3"/>
-        </w:rPr>
-        <w:t xml:space="preserve"> </w:t>
-      </w:r>
-      <w:r>
-        <w:t>principe est revenu sous une forme différente : garder une</w:t>
+        <w:t>state, offsets</w:t>
+      </w:r>
+      <w:r>
+        <w:rPr>
+          <w:spacing w:val="-1"/>
+        </w:rPr>
+        <w:t xml:space="preserve"> </w:t>
+      </w:r>
+      <w:r>
+        <w:t>Kafka, Model</w:t>
+      </w:r>
+      <w:r>
+        <w:rPr>
+          <w:spacing w:val="36"/>
+        </w:rPr>
+        <w:t xml:space="preserve"> </w:t>
+      </w:r>
+      <w:r>
+        <w:t>Registry) et vérifier qu’un</w:t>
       </w:r>
       <w:r>
         <w:rPr>
@@ -16380,34 +16549,7 @@
         <w:t xml:space="preserve"> </w:t>
       </w:r>
       <w:r>
-        <w:t>trace plutôt que présumer (Git, Terraform</w:t>
-      </w:r>
-      <w:r>
-        <w:rPr>
-          <w:spacing w:val="-5"/>
-        </w:rPr>
-        <w:t xml:space="preserve"> </w:t>
-      </w:r>
-      <w:r>
-        <w:t>state, offsets</w:t>
-      </w:r>
-      <w:r>
-        <w:rPr>
-          <w:spacing w:val="-1"/>
-        </w:rPr>
-        <w:t xml:space="preserve"> </w:t>
-      </w:r>
-      <w:r>
-        <w:t>Kafka, Model</w:t>
-      </w:r>
-      <w:r>
-        <w:rPr>
-          <w:spacing w:val="36"/>
-        </w:rPr>
-        <w:t xml:space="preserve"> </w:t>
-      </w:r>
-      <w:r>
-        <w:t>Registry), et vérifier qu’un</w:t>
+        <w:t>système produit vraiment ce qu’on</w:t>
       </w:r>
       <w:r>
         <w:rPr>
@@ -16416,15 +16558,6 @@
         <w:t xml:space="preserve"> </w:t>
       </w:r>
       <w:r>
-        <w:t>système produit vraiment ce qu’on</w:t>
-      </w:r>
-      <w:r>
-        <w:rPr>
-          <w:spacing w:val="-2"/>
-        </w:rPr>
-        <w:t xml:space="preserve"> </w:t>
-      </w:r>
-      <w:r>
         <w:t>attend de lui plutôt que de se fier à l’absence d’erreur (idempotence Airflow, fraîcheur Prometheus, dérive</w:t>
       </w:r>
       <w:r>
@@ -16443,7 +16576,7 @@
         <w:t xml:space="preserve"> </w:t>
       </w:r>
       <w:r>
-        <w:t>ses angles morts. Je les assume ici plutôt que de les taire, parce que savoir où sont les limites de ce qu’on a construit fait, je crois, autant partie du métier d’ingénieur que savoir le faire tourner.</w:t>
+        <w:t>ses angles morts. Je les assume ici plutôt que de les taire parce que savoir où sont les limites de ce qu’on a construit fait, je crois, autant partie du métier d’ingénieur que savoir le faire tourner.</w:t>
       </w:r>
     </w:p>
     <w:sectPr>

</xml_diff>